<commit_message>
fix: align paper text and output columns with F-test-first logic
- Fix §3 paper text to describe F-test as primary criterion (not engineering thresholds)
- Fix §8 to say "F检验为统计依据" instead of "同时考虑统计显著性和工程效应量"
- Fix estimates_summary column "是否采用系统偏差修正" to report actual decision
- Add "工程效应量达标" as separate reference column
- Fix result.xlsx template detection to scan all columns for "注意"/"填写范例"
- Restore clean template from 附件4.xlsx
- Regenerate all binary outputs with correct Problem 3 bias values
</commit_message>
<xml_diff>
--- a/2026_B题/outputs/B题_多源融合机器人定位及任务优化_论文_90分版.docx
+++ b/2026_B题/outputs/B题_多源融合机器人定位及任务优化_论文_90分版.docx
@@ -29,7 +29,7 @@
           <w:rFonts w:ascii="宋体" w:hAnsi="宋体"/>
           <w:sz w:val="24"/>
         </w:rPr>
-        <w:t>针对两种异频异步定位方式，本文建立“时间平移—固定偏差估计—10Hz重采样融合”的多源定位模型。问题1在无噪声条件下，以方式1为基准得到方式2相对时间偏差为 198.4317s，时间平移后两轨迹均方残差接近0。问题2在随机噪声和固定系统偏差并存条件下，估计方式2相对时间偏差为 50.5731s，95%置信区间为 [50.5679,50.5762]s，方式2相对方式1的固定坐标偏差为 (3.4923,-1.8225)m。问题3实测数据中，带偏差模型候选偏差为 (-0.1495,-0.2095)m，误差下降比例为 1.65%；尽管大样本F检验可检出微小均值漂移（F=25.17, p=1.44e-11），但其幅值和误差改善均低于工程效应量阈值，因此不采用固定系统偏差修正。问题4在附件3融合轨迹上生成可行任务候选，并用0-1整数规划最大化期望完成数，得到 18 项非重叠任务，其中模拟射击 5 项、拍照 13 项，期望完成数为 17.25。全部任务满足距离、速度、加速度、准备时间和拍照角度约束。</w:t>
+        <w:t>针对两种异频异步定位方式，本文建立“时间平移—固定偏差估计—10Hz重采样融合”的多源定位模型。问题1在无噪声条件下，以方式1为基准得到方式2相对时间偏差为 198.4317s，时间平移后两轨迹均方残差接近0。问题2在随机噪声和固定系统偏差并存条件下，估计方式2相对时间偏差为 50.5731s，95%置信区间为 [50.5679,50.5762]s，方式2相对方式1的固定坐标偏差为 (3.4923,-1.8225)m。问题3实测数据经F检验，在α=0.05水平上检出系统偏差（F=25.17, p=1.44e-11），偏差估计值为 (-0.1495,-0.2095)m；偏差模长0.257m、误差改善1.65%，虽量级较小，仍按统计结论予以修正。问题4在附件3融合轨迹上生成可行任务候选，并用0-1整数规划最大化期望完成数，得到 18 项非重叠任务，其中模拟射击 5 项、拍照 13 项，期望完成数为 17.25。全部任务满足距离、速度、加速度、准备时间和拍照角度约束。</w:t>
       </w:r>
     </w:p>
     <w:p>
@@ -219,7 +219,7 @@
           <w:rFonts w:ascii="宋体" w:hAnsi="宋体"/>
           <w:sz w:val="24"/>
         </w:rPr>
-        <w:t>实际求解时先在允许区间内粗搜索，再用有界一维优化细化 $\delta$。对问题2、问题3，本文比较无偏模型和带偏模型的残差平方和，采用嵌套模型F检验判断固定偏差项是否具有统计显著性。考虑到实际测量数据样本量较大，微小均值漂移也可能被检出，本文再引入工程效应量判据：误差下降比例不小于5%且偏差模长不小于0.5m时，才采用固定偏差修正。这样可以避免把随机噪声或微小漂移解释成需要修正的系统误差。</w:t>
+        <w:t>实际求解时先在允许区间内粗搜索，再用有界一维优化细化 $\delta$。对问题2、问题3，本文比较无偏模型和带偏模型的残差平方和，采用嵌套模型F检验判断固定偏差项是否具有统计显著性（$\alpha=0.05$）：若p值小于0.05，则判定存在系统偏差，使用带偏模型估计偏差值并修正轨迹。由于大样本下微小均值漂移也可能被检出，本文在结果中附加工程效应量（误差下降比例和偏差模长）作为量级参考，但不改变统计检验的确定性结论。</w:t>
       </w:r>
     </w:p>
     <w:p>
@@ -381,7 +381,7 @@
           <w:rFonts w:ascii="宋体" w:hAnsi="宋体"/>
           <w:sz w:val="24"/>
         </w:rPr>
-        <w:t>候选任务数为 341，求解状态为 `milp_optimal`。该模型在10Hz离散候选集上给出全局最优解；连续时间下的更细优化可在后续用更小步长继续逼近。</w:t>
+        <w:t>候选任务数为 337，求解状态为 `milp_optimal`。该模型在10Hz离散候选集上给出全局最优解；连续时间下的更细优化可在后续用更小步长继续逼近。</w:t>
       </w:r>
     </w:p>
     <w:p>
@@ -710,7 +710,7 @@
           </w:tcPr>
           <w:p>
             <w:r>
-              <w:t>-367.9164</w:t>
+              <w:t>-367.9214</w:t>
             </w:r>
           </w:p>
         </w:tc>
@@ -720,7 +720,7 @@
           </w:tcPr>
           <w:p>
             <w:r>
-              <w:t>[-367.9237,-367.9086]</w:t>
+              <w:t>[-367.9282,-367.9133]</w:t>
             </w:r>
           </w:p>
         </w:tc>
@@ -730,7 +730,7 @@
           </w:tcPr>
           <w:p>
             <w:r>
-              <w:t>0</w:t>
+              <w:t>-0.1495</w:t>
             </w:r>
           </w:p>
         </w:tc>
@@ -740,7 +740,7 @@
           </w:tcPr>
           <w:p>
             <w:r>
-              <w:t>0</w:t>
+              <w:t>-0.2095</w:t>
             </w:r>
           </w:p>
         </w:tc>
@@ -780,7 +780,7 @@
           </w:tcPr>
           <w:p>
             <w:r>
-              <w:t>工程量级不足，不修正</w:t>
+              <w:t>存在并修正（量级较小）</w:t>
             </w:r>
           </w:p>
         </w:tc>
@@ -1094,7 +1094,7 @@
           </w:tcPr>
           <w:p>
             <w:r>
-              <w:t>P13</w:t>
+              <w:t>P04</w:t>
             </w:r>
           </w:p>
         </w:tc>
@@ -1134,7 +1134,7 @@
           </w:tcPr>
           <w:p>
             <w:r>
-              <w:t>16.5092</w:t>
+              <w:t>18.3236</w:t>
             </w:r>
           </w:p>
         </w:tc>
@@ -1144,7 +1144,7 @@
           </w:tcPr>
           <w:p>
             <w:r>
-              <w:t>1.0894</w:t>
+              <w:t>1.0964</w:t>
             </w:r>
           </w:p>
         </w:tc>
@@ -1154,7 +1154,7 @@
           </w:tcPr>
           <w:p>
             <w:r>
-              <w:t>0.3653</w:t>
+              <w:t>0.3635</w:t>
             </w:r>
           </w:p>
         </w:tc>
@@ -1164,7 +1164,7 @@
           </w:tcPr>
           <w:p>
             <w:r>
-              <w:t>332.4298</w:t>
+              <w:t>78.5032</w:t>
             </w:r>
           </w:p>
         </w:tc>
@@ -1186,7 +1186,7 @@
           </w:tcPr>
           <w:p>
             <w:r>
-              <w:t>P02</w:t>
+              <w:t>P13</w:t>
             </w:r>
           </w:p>
         </w:tc>
@@ -1226,7 +1226,7 @@
           </w:tcPr>
           <w:p>
             <w:r>
-              <w:t>24.9486</w:t>
+              <w:t>17.3932</w:t>
             </w:r>
           </w:p>
         </w:tc>
@@ -1236,7 +1236,7 @@
           </w:tcPr>
           <w:p>
             <w:r>
-              <w:t>0.8653</w:t>
+              <w:t>0.8683</w:t>
             </w:r>
           </w:p>
         </w:tc>
@@ -1246,7 +1246,7 @@
           </w:tcPr>
           <w:p>
             <w:r>
-              <w:t>0.4178</w:t>
+              <w:t>0.4188</w:t>
             </w:r>
           </w:p>
         </w:tc>
@@ -1256,7 +1256,99 @@
           </w:tcPr>
           <w:p>
             <w:r>
-              <w:t>121.9799</w:t>
+              <w:t>330.9585</w:t>
+            </w:r>
+          </w:p>
+        </w:tc>
+        <w:tc>
+          <w:tcPr>
+            <w:tcW w:type="dxa" w:w="960"/>
+          </w:tcPr>
+          <w:p>
+            <w:r>
+              <w:t>1.0000</w:t>
+            </w:r>
+          </w:p>
+        </w:tc>
+      </w:tr>
+      <w:tr>
+        <w:tc>
+          <w:tcPr>
+            <w:tcW w:type="dxa" w:w="960"/>
+          </w:tcPr>
+          <w:p>
+            <w:r>
+              <w:t>P12</w:t>
+            </w:r>
+          </w:p>
+        </w:tc>
+        <w:tc>
+          <w:tcPr>
+            <w:tcW w:type="dxa" w:w="960"/>
+          </w:tcPr>
+          <w:p>
+            <w:r>
+              <w:t>拍照</w:t>
+            </w:r>
+          </w:p>
+        </w:tc>
+        <w:tc>
+          <w:tcPr>
+            <w:tcW w:type="dxa" w:w="960"/>
+          </w:tcPr>
+          <w:p>
+            <w:r>
+              <w:t>481.0000</w:t>
+            </w:r>
+          </w:p>
+        </w:tc>
+        <w:tc>
+          <w:tcPr>
+            <w:tcW w:type="dxa" w:w="960"/>
+          </w:tcPr>
+          <w:p>
+            <w:r>
+              <w:t>481.5000</w:t>
+            </w:r>
+          </w:p>
+        </w:tc>
+        <w:tc>
+          <w:tcPr>
+            <w:tcW w:type="dxa" w:w="960"/>
+          </w:tcPr>
+          <w:p>
+            <w:r>
+              <w:t>22.2972</w:t>
+            </w:r>
+          </w:p>
+        </w:tc>
+        <w:tc>
+          <w:tcPr>
+            <w:tcW w:type="dxa" w:w="960"/>
+          </w:tcPr>
+          <w:p>
+            <w:r>
+              <w:t>0.8364</w:t>
+            </w:r>
+          </w:p>
+        </w:tc>
+        <w:tc>
+          <w:tcPr>
+            <w:tcW w:type="dxa" w:w="960"/>
+          </w:tcPr>
+          <w:p>
+            <w:r>
+              <w:t>0.3170</w:t>
+            </w:r>
+          </w:p>
+        </w:tc>
+        <w:tc>
+          <w:tcPr>
+            <w:tcW w:type="dxa" w:w="960"/>
+          </w:tcPr>
+          <w:p>
+            <w:r>
+              <w:t>308.6717</w:t>
             </w:r>
           </w:p>
         </w:tc>
@@ -1298,16 +1390,6 @@
           </w:tcPr>
           <w:p>
             <w:r>
-              <w:t>481.0000</w:t>
-            </w:r>
-          </w:p>
-        </w:tc>
-        <w:tc>
-          <w:tcPr>
-            <w:tcW w:type="dxa" w:w="960"/>
-          </w:tcPr>
-          <w:p>
-            <w:r>
               <w:t>481.5000</w:t>
             </w:r>
           </w:p>
@@ -1318,7 +1400,7 @@
           </w:tcPr>
           <w:p>
             <w:r>
-              <w:t>20.9297</w:t>
+              <w:t>482.0000</w:t>
             </w:r>
           </w:p>
         </w:tc>
@@ -1328,7 +1410,7 @@
           </w:tcPr>
           <w:p>
             <w:r>
-              <w:t>0.8368</w:t>
+              <w:t>20.7378</w:t>
             </w:r>
           </w:p>
         </w:tc>
@@ -1338,7 +1420,7 @@
           </w:tcPr>
           <w:p>
             <w:r>
-              <w:t>0.3160</w:t>
+              <w:t>1.0322</w:t>
             </w:r>
           </w:p>
         </w:tc>
@@ -1348,7 +1430,7 @@
           </w:tcPr>
           <w:p>
             <w:r>
-              <w:t>133.4380</w:t>
+              <w:t>0.3731</w:t>
             </w:r>
           </w:p>
         </w:tc>
@@ -1358,89 +1440,7 @@
           </w:tcPr>
           <w:p>
             <w:r>
-              <w:t>1.0000</w:t>
-            </w:r>
-          </w:p>
-        </w:tc>
-      </w:tr>
-      <w:tr>
-        <w:tc>
-          <w:tcPr>
-            <w:tcW w:type="dxa" w:w="960"/>
-          </w:tcPr>
-          <w:p>
-            <w:r>
-              <w:t>P12</w:t>
-            </w:r>
-          </w:p>
-        </w:tc>
-        <w:tc>
-          <w:tcPr>
-            <w:tcW w:type="dxa" w:w="960"/>
-          </w:tcPr>
-          <w:p>
-            <w:r>
-              <w:t>拍照</w:t>
-            </w:r>
-          </w:p>
-        </w:tc>
-        <w:tc>
-          <w:tcPr>
-            <w:tcW w:type="dxa" w:w="960"/>
-          </w:tcPr>
-          <w:p>
-            <w:r>
-              <w:t>481.7000</w:t>
-            </w:r>
-          </w:p>
-        </w:tc>
-        <w:tc>
-          <w:tcPr>
-            <w:tcW w:type="dxa" w:w="960"/>
-          </w:tcPr>
-          <w:p>
-            <w:r>
-              <w:t>482.2000</w:t>
-            </w:r>
-          </w:p>
-        </w:tc>
-        <w:tc>
-          <w:tcPr>
-            <w:tcW w:type="dxa" w:w="960"/>
-          </w:tcPr>
-          <w:p>
-            <w:r>
-              <w:t>22.5202</w:t>
-            </w:r>
-          </w:p>
-        </w:tc>
-        <w:tc>
-          <w:tcPr>
-            <w:tcW w:type="dxa" w:w="960"/>
-          </w:tcPr>
-          <w:p>
-            <w:r>
-              <w:t>1.3837</w:t>
-            </w:r>
-          </w:p>
-        </w:tc>
-        <w:tc>
-          <w:tcPr>
-            <w:tcW w:type="dxa" w:w="960"/>
-          </w:tcPr>
-          <w:p>
-            <w:r>
-              <w:t>0.5309</w:t>
-            </w:r>
-          </w:p>
-        </w:tc>
-        <w:tc>
-          <w:tcPr>
-            <w:tcW w:type="dxa" w:w="960"/>
-          </w:tcPr>
-          <w:p>
-            <w:r>
-              <w:t>309.4005</w:t>
+              <w:t>133.7653</w:t>
             </w:r>
           </w:p>
         </w:tc>
@@ -1502,7 +1502,7 @@
           </w:tcPr>
           <w:p>
             <w:r>
-              <w:t>14.7898</w:t>
+              <w:t>14.6695</w:t>
             </w:r>
           </w:p>
         </w:tc>
@@ -1512,7 +1512,7 @@
           </w:tcPr>
           <w:p>
             <w:r>
-              <w:t>1.2904</w:t>
+              <w:t>1.2878</w:t>
             </w:r>
           </w:p>
         </w:tc>
@@ -1522,7 +1522,7 @@
           </w:tcPr>
           <w:p>
             <w:r>
-              <w:t>1.2686</w:t>
+              <w:t>1.2673</w:t>
             </w:r>
           </w:p>
         </w:tc>
@@ -1532,7 +1532,283 @@
           </w:tcPr>
           <w:p>
             <w:r>
-              <w:t>70.9294</w:t>
+              <w:t>71.1097</w:t>
+            </w:r>
+          </w:p>
+        </w:tc>
+        <w:tc>
+          <w:tcPr>
+            <w:tcW w:type="dxa" w:w="960"/>
+          </w:tcPr>
+          <w:p>
+            <w:r>
+              <w:t>1.0000</w:t>
+            </w:r>
+          </w:p>
+        </w:tc>
+      </w:tr>
+      <w:tr>
+        <w:tc>
+          <w:tcPr>
+            <w:tcW w:type="dxa" w:w="960"/>
+          </w:tcPr>
+          <w:p>
+            <w:r>
+              <w:t>P04</w:t>
+            </w:r>
+          </w:p>
+        </w:tc>
+        <w:tc>
+          <w:tcPr>
+            <w:tcW w:type="dxa" w:w="960"/>
+          </w:tcPr>
+          <w:p>
+            <w:r>
+              <w:t>拍照</w:t>
+            </w:r>
+          </w:p>
+        </w:tc>
+        <w:tc>
+          <w:tcPr>
+            <w:tcW w:type="dxa" w:w="960"/>
+          </w:tcPr>
+          <w:p>
+            <w:r>
+              <w:t>492.6000</w:t>
+            </w:r>
+          </w:p>
+        </w:tc>
+        <w:tc>
+          <w:tcPr>
+            <w:tcW w:type="dxa" w:w="960"/>
+          </w:tcPr>
+          <w:p>
+            <w:r>
+              <w:t>493.1000</w:t>
+            </w:r>
+          </w:p>
+        </w:tc>
+        <w:tc>
+          <w:tcPr>
+            <w:tcW w:type="dxa" w:w="960"/>
+          </w:tcPr>
+          <w:p>
+            <w:r>
+              <w:t>33.5617</w:t>
+            </w:r>
+          </w:p>
+        </w:tc>
+        <w:tc>
+          <w:tcPr>
+            <w:tcW w:type="dxa" w:w="960"/>
+          </w:tcPr>
+          <w:p>
+            <w:r>
+              <w:t>0.3841</w:t>
+            </w:r>
+          </w:p>
+        </w:tc>
+        <w:tc>
+          <w:tcPr>
+            <w:tcW w:type="dxa" w:w="960"/>
+          </w:tcPr>
+          <w:p>
+            <w:r>
+              <w:t>0.4936</w:t>
+            </w:r>
+          </w:p>
+        </w:tc>
+        <w:tc>
+          <w:tcPr>
+            <w:tcW w:type="dxa" w:w="960"/>
+          </w:tcPr>
+          <w:p>
+            <w:r>
+              <w:t>13.2672</w:t>
+            </w:r>
+          </w:p>
+        </w:tc>
+        <w:tc>
+          <w:tcPr>
+            <w:tcW w:type="dxa" w:w="960"/>
+          </w:tcPr>
+          <w:p>
+            <w:r>
+              <w:t>1.0000</w:t>
+            </w:r>
+          </w:p>
+        </w:tc>
+      </w:tr>
+      <w:tr>
+        <w:tc>
+          <w:tcPr>
+            <w:tcW w:type="dxa" w:w="960"/>
+          </w:tcPr>
+          <w:p>
+            <w:r>
+              <w:t>P02</w:t>
+            </w:r>
+          </w:p>
+        </w:tc>
+        <w:tc>
+          <w:tcPr>
+            <w:tcW w:type="dxa" w:w="960"/>
+          </w:tcPr>
+          <w:p>
+            <w:r>
+              <w:t>拍照</w:t>
+            </w:r>
+          </w:p>
+        </w:tc>
+        <w:tc>
+          <w:tcPr>
+            <w:tcW w:type="dxa" w:w="960"/>
+          </w:tcPr>
+          <w:p>
+            <w:r>
+              <w:t>493.1000</w:t>
+            </w:r>
+          </w:p>
+        </w:tc>
+        <w:tc>
+          <w:tcPr>
+            <w:tcW w:type="dxa" w:w="960"/>
+          </w:tcPr>
+          <w:p>
+            <w:r>
+              <w:t>493.6000</w:t>
+            </w:r>
+          </w:p>
+        </w:tc>
+        <w:tc>
+          <w:tcPr>
+            <w:tcW w:type="dxa" w:w="960"/>
+          </w:tcPr>
+          <w:p>
+            <w:r>
+              <w:t>19.0358</w:t>
+            </w:r>
+          </w:p>
+        </w:tc>
+        <w:tc>
+          <w:tcPr>
+            <w:tcW w:type="dxa" w:w="960"/>
+          </w:tcPr>
+          <w:p>
+            <w:r>
+              <w:t>0.3068</w:t>
+            </w:r>
+          </w:p>
+        </w:tc>
+        <w:tc>
+          <w:tcPr>
+            <w:tcW w:type="dxa" w:w="960"/>
+          </w:tcPr>
+          <w:p>
+            <w:r>
+              <w:t>0.6055</w:t>
+            </w:r>
+          </w:p>
+        </w:tc>
+        <w:tc>
+          <w:tcPr>
+            <w:tcW w:type="dxa" w:w="960"/>
+          </w:tcPr>
+          <w:p>
+            <w:r>
+              <w:t>35.1911</w:t>
+            </w:r>
+          </w:p>
+        </w:tc>
+        <w:tc>
+          <w:tcPr>
+            <w:tcW w:type="dxa" w:w="960"/>
+          </w:tcPr>
+          <w:p>
+            <w:r>
+              <w:t>1.0000</w:t>
+            </w:r>
+          </w:p>
+        </w:tc>
+      </w:tr>
+      <w:tr>
+        <w:tc>
+          <w:tcPr>
+            <w:tcW w:type="dxa" w:w="960"/>
+          </w:tcPr>
+          <w:p>
+            <w:r>
+              <w:t>P11</w:t>
+            </w:r>
+          </w:p>
+        </w:tc>
+        <w:tc>
+          <w:tcPr>
+            <w:tcW w:type="dxa" w:w="960"/>
+          </w:tcPr>
+          <w:p>
+            <w:r>
+              <w:t>拍照</w:t>
+            </w:r>
+          </w:p>
+        </w:tc>
+        <w:tc>
+          <w:tcPr>
+            <w:tcW w:type="dxa" w:w="960"/>
+          </w:tcPr>
+          <w:p>
+            <w:r>
+              <w:t>493.6000</w:t>
+            </w:r>
+          </w:p>
+        </w:tc>
+        <w:tc>
+          <w:tcPr>
+            <w:tcW w:type="dxa" w:w="960"/>
+          </w:tcPr>
+          <w:p>
+            <w:r>
+              <w:t>494.1000</w:t>
+            </w:r>
+          </w:p>
+        </w:tc>
+        <w:tc>
+          <w:tcPr>
+            <w:tcW w:type="dxa" w:w="960"/>
+          </w:tcPr>
+          <w:p>
+            <w:r>
+              <w:t>28.4608</w:t>
+            </w:r>
+          </w:p>
+        </w:tc>
+        <w:tc>
+          <w:tcPr>
+            <w:tcW w:type="dxa" w:w="960"/>
+          </w:tcPr>
+          <w:p>
+            <w:r>
+              <w:t>0.6404</w:t>
+            </w:r>
+          </w:p>
+        </w:tc>
+        <w:tc>
+          <w:tcPr>
+            <w:tcW w:type="dxa" w:w="960"/>
+          </w:tcPr>
+          <w:p>
+            <w:r>
+              <w:t>0.3325</w:t>
+            </w:r>
+          </w:p>
+        </w:tc>
+        <w:tc>
+          <w:tcPr>
+            <w:tcW w:type="dxa" w:w="960"/>
+          </w:tcPr>
+          <w:p>
+            <w:r>
+              <w:t>322.4343</w:t>
             </w:r>
           </w:p>
         </w:tc>
@@ -1574,200 +1850,6 @@
           </w:tcPr>
           <w:p>
             <w:r>
-              <w:t>492.6000</w:t>
-            </w:r>
-          </w:p>
-        </w:tc>
-        <w:tc>
-          <w:tcPr>
-            <w:tcW w:type="dxa" w:w="960"/>
-          </w:tcPr>
-          <w:p>
-            <w:r>
-              <w:t>493.1000</w:t>
-            </w:r>
-          </w:p>
-        </w:tc>
-        <w:tc>
-          <w:tcPr>
-            <w:tcW w:type="dxa" w:w="960"/>
-          </w:tcPr>
-          <w:p>
-            <w:r>
-              <w:t>28.9279</w:t>
-            </w:r>
-          </w:p>
-        </w:tc>
-        <w:tc>
-          <w:tcPr>
-            <w:tcW w:type="dxa" w:w="960"/>
-          </w:tcPr>
-          <w:p>
-            <w:r>
-              <w:t>0.3856</w:t>
-            </w:r>
-          </w:p>
-        </w:tc>
-        <w:tc>
-          <w:tcPr>
-            <w:tcW w:type="dxa" w:w="960"/>
-          </w:tcPr>
-          <w:p>
-            <w:r>
-              <w:t>0.4931</w:t>
-            </w:r>
-          </w:p>
-        </w:tc>
-        <w:tc>
-          <w:tcPr>
-            <w:tcW w:type="dxa" w:w="960"/>
-          </w:tcPr>
-          <w:p>
-            <w:r>
-              <w:t>292.6498</w:t>
-            </w:r>
-          </w:p>
-        </w:tc>
-        <w:tc>
-          <w:tcPr>
-            <w:tcW w:type="dxa" w:w="960"/>
-          </w:tcPr>
-          <w:p>
-            <w:r>
-              <w:t>1.0000</w:t>
-            </w:r>
-          </w:p>
-        </w:tc>
-      </w:tr>
-      <w:tr>
-        <w:tc>
-          <w:tcPr>
-            <w:tcW w:type="dxa" w:w="960"/>
-          </w:tcPr>
-          <w:p>
-            <w:r>
-              <w:t>P11</w:t>
-            </w:r>
-          </w:p>
-        </w:tc>
-        <w:tc>
-          <w:tcPr>
-            <w:tcW w:type="dxa" w:w="960"/>
-          </w:tcPr>
-          <w:p>
-            <w:r>
-              <w:t>拍照</w:t>
-            </w:r>
-          </w:p>
-        </w:tc>
-        <w:tc>
-          <w:tcPr>
-            <w:tcW w:type="dxa" w:w="960"/>
-          </w:tcPr>
-          <w:p>
-            <w:r>
-              <w:t>493.1000</w:t>
-            </w:r>
-          </w:p>
-        </w:tc>
-        <w:tc>
-          <w:tcPr>
-            <w:tcW w:type="dxa" w:w="960"/>
-          </w:tcPr>
-          <w:p>
-            <w:r>
-              <w:t>493.6000</w:t>
-            </w:r>
-          </w:p>
-        </w:tc>
-        <w:tc>
-          <w:tcPr>
-            <w:tcW w:type="dxa" w:w="960"/>
-          </w:tcPr>
-          <w:p>
-            <w:r>
-              <w:t>28.5030</w:t>
-            </w:r>
-          </w:p>
-        </w:tc>
-        <w:tc>
-          <w:tcPr>
-            <w:tcW w:type="dxa" w:w="960"/>
-          </w:tcPr>
-          <w:p>
-            <w:r>
-              <w:t>0.3075</w:t>
-            </w:r>
-          </w:p>
-        </w:tc>
-        <w:tc>
-          <w:tcPr>
-            <w:tcW w:type="dxa" w:w="960"/>
-          </w:tcPr>
-          <w:p>
-            <w:r>
-              <w:t>0.6050</w:t>
-            </w:r>
-          </w:p>
-        </w:tc>
-        <w:tc>
-          <w:tcPr>
-            <w:tcW w:type="dxa" w:w="960"/>
-          </w:tcPr>
-          <w:p>
-            <w:r>
-              <w:t>323.5629</w:t>
-            </w:r>
-          </w:p>
-        </w:tc>
-        <w:tc>
-          <w:tcPr>
-            <w:tcW w:type="dxa" w:w="960"/>
-          </w:tcPr>
-          <w:p>
-            <w:r>
-              <w:t>1.0000</w:t>
-            </w:r>
-          </w:p>
-        </w:tc>
-      </w:tr>
-      <w:tr>
-        <w:tc>
-          <w:tcPr>
-            <w:tcW w:type="dxa" w:w="960"/>
-          </w:tcPr>
-          <w:p>
-            <w:r>
-              <w:t>P02</w:t>
-            </w:r>
-          </w:p>
-        </w:tc>
-        <w:tc>
-          <w:tcPr>
-            <w:tcW w:type="dxa" w:w="960"/>
-          </w:tcPr>
-          <w:p>
-            <w:r>
-              <w:t>拍照</w:t>
-            </w:r>
-          </w:p>
-        </w:tc>
-        <w:tc>
-          <w:tcPr>
-            <w:tcW w:type="dxa" w:w="960"/>
-          </w:tcPr>
-          <w:p>
-            <w:r>
-              <w:t>493.6000</w:t>
-            </w:r>
-          </w:p>
-        </w:tc>
-        <w:tc>
-          <w:tcPr>
-            <w:tcW w:type="dxa" w:w="960"/>
-          </w:tcPr>
-          <w:p>
-            <w:r>
               <w:t>494.1000</w:t>
             </w:r>
           </w:p>
@@ -1778,7 +1860,7 @@
           </w:tcPr>
           <w:p>
             <w:r>
-              <w:t>18.7262</w:t>
+              <w:t>494.6000</w:t>
             </w:r>
           </w:p>
         </w:tc>
@@ -1788,7 +1870,7 @@
           </w:tcPr>
           <w:p>
             <w:r>
-              <w:t>0.6402</w:t>
+              <w:t>29.8615</w:t>
             </w:r>
           </w:p>
         </w:tc>
@@ -1798,7 +1880,7 @@
           </w:tcPr>
           <w:p>
             <w:r>
-              <w:t>0.3327</w:t>
+              <w:t>0.7778</w:t>
             </w:r>
           </w:p>
         </w:tc>
@@ -1808,7 +1890,17 @@
           </w:tcPr>
           <w:p>
             <w:r>
-              <w:t>35.0249</w:t>
+              <w:t>0.4976</w:t>
+            </w:r>
+          </w:p>
+        </w:tc>
+        <w:tc>
+          <w:tcPr>
+            <w:tcW w:type="dxa" w:w="960"/>
+          </w:tcPr>
+          <w:p>
+            <w:r>
+              <w:t>291.3170</w:t>
             </w:r>
           </w:p>
         </w:tc>
@@ -1850,16 +1942,6 @@
           </w:tcPr>
           <w:p>
             <w:r>
-              <w:t>494.1000</w:t>
-            </w:r>
-          </w:p>
-        </w:tc>
-        <w:tc>
-          <w:tcPr>
-            <w:tcW w:type="dxa" w:w="960"/>
-          </w:tcPr>
-          <w:p>
-            <w:r>
               <w:t>494.6000</w:t>
             </w:r>
           </w:p>
@@ -1870,7 +1952,7 @@
           </w:tcPr>
           <w:p>
             <w:r>
-              <w:t>23.5221</w:t>
+              <w:t>495.1000</w:t>
             </w:r>
           </w:p>
         </w:tc>
@@ -1880,7 +1962,7 @@
           </w:tcPr>
           <w:p>
             <w:r>
-              <w:t>0.7802</w:t>
+              <w:t>22.9921</w:t>
             </w:r>
           </w:p>
         </w:tc>
@@ -1890,7 +1972,7 @@
           </w:tcPr>
           <w:p>
             <w:r>
-              <w:t>0.4998</w:t>
+              <w:t>1.4743</w:t>
             </w:r>
           </w:p>
         </w:tc>
@@ -1900,7 +1982,17 @@
           </w:tcPr>
           <w:p>
             <w:r>
-              <w:t>350.9127</w:t>
+              <w:t>0.8241</w:t>
+            </w:r>
+          </w:p>
+        </w:tc>
+        <w:tc>
+          <w:tcPr>
+            <w:tcW w:type="dxa" w:w="960"/>
+          </w:tcPr>
+          <w:p>
+            <w:r>
+              <w:t>349.4506</w:t>
             </w:r>
           </w:p>
         </w:tc>
@@ -1922,7 +2014,97 @@
           </w:tcPr>
           <w:p>
             <w:r>
-              <w:t>P04</w:t>
+              <w:t>S12</w:t>
+            </w:r>
+          </w:p>
+        </w:tc>
+        <w:tc>
+          <w:tcPr>
+            <w:tcW w:type="dxa" w:w="960"/>
+          </w:tcPr>
+          <w:p>
+            <w:r>
+              <w:t>模拟射击</w:t>
+            </w:r>
+          </w:p>
+        </w:tc>
+        <w:tc>
+          <w:tcPr>
+            <w:tcW w:type="dxa" w:w="960"/>
+          </w:tcPr>
+          <w:p>
+            <w:r>
+              <w:t>507.2000</w:t>
+            </w:r>
+          </w:p>
+        </w:tc>
+        <w:tc>
+          <w:tcPr>
+            <w:tcW w:type="dxa" w:w="960"/>
+          </w:tcPr>
+          <w:p>
+            <w:r>
+              <w:t>508.7000</w:t>
+            </w:r>
+          </w:p>
+        </w:tc>
+        <w:tc>
+          <w:tcPr>
+            <w:tcW w:type="dxa" w:w="960"/>
+          </w:tcPr>
+          <w:p>
+            <w:r>
+              <w:t>26.6631</w:t>
+            </w:r>
+          </w:p>
+        </w:tc>
+        <w:tc>
+          <w:tcPr>
+            <w:tcW w:type="dxa" w:w="960"/>
+          </w:tcPr>
+          <w:p>
+            <w:r>
+              <w:t>0.7624</w:t>
+            </w:r>
+          </w:p>
+        </w:tc>
+        <w:tc>
+          <w:tcPr>
+            <w:tcW w:type="dxa" w:w="960"/>
+          </w:tcPr>
+          <w:p>
+            <w:r>
+              <w:t>0.2358</w:t>
+            </w:r>
+          </w:p>
+        </w:tc>
+        <w:tc>
+          <w:tcPr>
+            <w:tcW w:type="dxa" w:w="960"/>
+          </w:tcPr>
+          <w:p>
+            <w:r/>
+          </w:p>
+        </w:tc>
+        <w:tc>
+          <w:tcPr>
+            <w:tcW w:type="dxa" w:w="960"/>
+          </w:tcPr>
+          <w:p>
+            <w:r>
+              <w:t>0.8500</w:t>
+            </w:r>
+          </w:p>
+        </w:tc>
+      </w:tr>
+      <w:tr>
+        <w:tc>
+          <w:tcPr>
+            <w:tcW w:type="dxa" w:w="960"/>
+          </w:tcPr>
+          <w:p>
+            <w:r>
+              <w:t>P02</w:t>
             </w:r>
           </w:p>
         </w:tc>
@@ -1942,7 +2124,7 @@
           </w:tcPr>
           <w:p>
             <w:r>
-              <w:t>494.6000</w:t>
+              <w:t>508.8000</w:t>
             </w:r>
           </w:p>
         </w:tc>
@@ -1952,7 +2134,7 @@
           </w:tcPr>
           <w:p>
             <w:r>
-              <w:t>495.1000</w:t>
+              <w:t>509.3000</w:t>
             </w:r>
           </w:p>
         </w:tc>
@@ -1962,7 +2144,7 @@
           </w:tcPr>
           <w:p>
             <w:r>
-              <w:t>32.6101</w:t>
+              <w:t>28.9549</w:t>
             </w:r>
           </w:p>
         </w:tc>
@@ -1972,7 +2154,7 @@
           </w:tcPr>
           <w:p>
             <w:r>
-              <w:t>1.4754</w:t>
+              <w:t>1.1069</w:t>
             </w:r>
           </w:p>
         </w:tc>
@@ -1982,7 +2164,7 @@
           </w:tcPr>
           <w:p>
             <w:r>
-              <w:t>0.8210</w:t>
+              <w:t>0.1134</w:t>
             </w:r>
           </w:p>
         </w:tc>
@@ -1992,7 +2174,99 @@
           </w:tcPr>
           <w:p>
             <w:r>
-              <w:t>11.2949</w:t>
+              <w:t>299.4933</w:t>
+            </w:r>
+          </w:p>
+        </w:tc>
+        <w:tc>
+          <w:tcPr>
+            <w:tcW w:type="dxa" w:w="960"/>
+          </w:tcPr>
+          <w:p>
+            <w:r>
+              <w:t>1.0000</w:t>
+            </w:r>
+          </w:p>
+        </w:tc>
+      </w:tr>
+      <w:tr>
+        <w:tc>
+          <w:tcPr>
+            <w:tcW w:type="dxa" w:w="960"/>
+          </w:tcPr>
+          <w:p>
+            <w:r>
+              <w:t>P01</w:t>
+            </w:r>
+          </w:p>
+        </w:tc>
+        <w:tc>
+          <w:tcPr>
+            <w:tcW w:type="dxa" w:w="960"/>
+          </w:tcPr>
+          <w:p>
+            <w:r>
+              <w:t>拍照</w:t>
+            </w:r>
+          </w:p>
+        </w:tc>
+        <w:tc>
+          <w:tcPr>
+            <w:tcW w:type="dxa" w:w="960"/>
+          </w:tcPr>
+          <w:p>
+            <w:r>
+              <w:t>509.8000</w:t>
+            </w:r>
+          </w:p>
+        </w:tc>
+        <w:tc>
+          <w:tcPr>
+            <w:tcW w:type="dxa" w:w="960"/>
+          </w:tcPr>
+          <w:p>
+            <w:r>
+              <w:t>510.3000</w:t>
+            </w:r>
+          </w:p>
+        </w:tc>
+        <w:tc>
+          <w:tcPr>
+            <w:tcW w:type="dxa" w:w="960"/>
+          </w:tcPr>
+          <w:p>
+            <w:r>
+              <w:t>33.7430</w:t>
+            </w:r>
+          </w:p>
+        </w:tc>
+        <w:tc>
+          <w:tcPr>
+            <w:tcW w:type="dxa" w:w="960"/>
+          </w:tcPr>
+          <w:p>
+            <w:r>
+              <w:t>0.5898</w:t>
+            </w:r>
+          </w:p>
+        </w:tc>
+        <w:tc>
+          <w:tcPr>
+            <w:tcW w:type="dxa" w:w="960"/>
+          </w:tcPr>
+          <w:p>
+            <w:r>
+              <w:t>0.2481</w:t>
+            </w:r>
+          </w:p>
+        </w:tc>
+        <w:tc>
+          <w:tcPr>
+            <w:tcW w:type="dxa" w:w="960"/>
+          </w:tcPr>
+          <w:p>
+            <w:r>
+              <w:t>280.1953</w:t>
             </w:r>
           </w:p>
         </w:tc>
@@ -2034,7 +2308,7 @@
           </w:tcPr>
           <w:p>
             <w:r>
-              <w:t>507.2000</w:t>
+              <w:t>510.6000</w:t>
             </w:r>
           </w:p>
         </w:tc>
@@ -2044,7 +2318,7 @@
           </w:tcPr>
           <w:p>
             <w:r>
-              <w:t>508.7000</w:t>
+              <w:t>512.1000</w:t>
             </w:r>
           </w:p>
         </w:tc>
@@ -2054,7 +2328,7 @@
           </w:tcPr>
           <w:p>
             <w:r>
-              <w:t>16.0919</w:t>
+              <w:t>18.1191</w:t>
             </w:r>
           </w:p>
         </w:tc>
@@ -2064,7 +2338,7 @@
           </w:tcPr>
           <w:p>
             <w:r>
-              <w:t>0.7633</w:t>
+              <w:t>1.9182</w:t>
             </w:r>
           </w:p>
         </w:tc>
@@ -2074,7 +2348,7 @@
           </w:tcPr>
           <w:p>
             <w:r>
-              <w:t>0.2361</w:t>
+              <w:t>0.4760</w:t>
             </w:r>
           </w:p>
         </w:tc>
@@ -2104,281 +2378,7 @@
           </w:tcPr>
           <w:p>
             <w:r>
-              <w:t>P01</w:t>
-            </w:r>
-          </w:p>
-        </w:tc>
-        <w:tc>
-          <w:tcPr>
-            <w:tcW w:type="dxa" w:w="960"/>
-          </w:tcPr>
-          <w:p>
-            <w:r>
-              <w:t>拍照</w:t>
-            </w:r>
-          </w:p>
-        </w:tc>
-        <w:tc>
-          <w:tcPr>
-            <w:tcW w:type="dxa" w:w="960"/>
-          </w:tcPr>
-          <w:p>
-            <w:r>
-              <w:t>508.8000</w:t>
-            </w:r>
-          </w:p>
-        </w:tc>
-        <w:tc>
-          <w:tcPr>
-            <w:tcW w:type="dxa" w:w="960"/>
-          </w:tcPr>
-          <w:p>
-            <w:r>
-              <w:t>509.3000</w:t>
-            </w:r>
-          </w:p>
-        </w:tc>
-        <w:tc>
-          <w:tcPr>
-            <w:tcW w:type="dxa" w:w="960"/>
-          </w:tcPr>
-          <w:p>
-            <w:r>
-              <w:t>32.9999</w:t>
-            </w:r>
-          </w:p>
-        </w:tc>
-        <w:tc>
-          <w:tcPr>
-            <w:tcW w:type="dxa" w:w="960"/>
-          </w:tcPr>
-          <w:p>
-            <w:r>
-              <w:t>1.1028</w:t>
-            </w:r>
-          </w:p>
-        </w:tc>
-        <w:tc>
-          <w:tcPr>
-            <w:tcW w:type="dxa" w:w="960"/>
-          </w:tcPr>
-          <w:p>
-            <w:r>
-              <w:t>0.1109</w:t>
-            </w:r>
-          </w:p>
-        </w:tc>
-        <w:tc>
-          <w:tcPr>
-            <w:tcW w:type="dxa" w:w="960"/>
-          </w:tcPr>
-          <w:p>
-            <w:r>
-              <w:t>279.9933</w:t>
-            </w:r>
-          </w:p>
-        </w:tc>
-        <w:tc>
-          <w:tcPr>
-            <w:tcW w:type="dxa" w:w="960"/>
-          </w:tcPr>
-          <w:p>
-            <w:r>
-              <w:t>1.0000</w:t>
-            </w:r>
-          </w:p>
-        </w:tc>
-      </w:tr>
-      <w:tr>
-        <w:tc>
-          <w:tcPr>
-            <w:tcW w:type="dxa" w:w="960"/>
-          </w:tcPr>
-          <w:p>
-            <w:r>
-              <w:t>P02</w:t>
-            </w:r>
-          </w:p>
-        </w:tc>
-        <w:tc>
-          <w:tcPr>
-            <w:tcW w:type="dxa" w:w="960"/>
-          </w:tcPr>
-          <w:p>
-            <w:r>
-              <w:t>拍照</w:t>
-            </w:r>
-          </w:p>
-        </w:tc>
-        <w:tc>
-          <w:tcPr>
-            <w:tcW w:type="dxa" w:w="960"/>
-          </w:tcPr>
-          <w:p>
-            <w:r>
-              <w:t>509.3000</w:t>
-            </w:r>
-          </w:p>
-        </w:tc>
-        <w:tc>
-          <w:tcPr>
-            <w:tcW w:type="dxa" w:w="960"/>
-          </w:tcPr>
-          <w:p>
-            <w:r>
-              <w:t>509.8000</w:t>
-            </w:r>
-          </w:p>
-        </w:tc>
-        <w:tc>
-          <w:tcPr>
-            <w:tcW w:type="dxa" w:w="960"/>
-          </w:tcPr>
-          <w:p>
-            <w:r>
-              <w:t>29.1734</w:t>
-            </w:r>
-          </w:p>
-        </w:tc>
-        <w:tc>
-          <w:tcPr>
-            <w:tcW w:type="dxa" w:w="960"/>
-          </w:tcPr>
-          <w:p>
-            <w:r>
-              <w:t>0.5983</w:t>
-            </w:r>
-          </w:p>
-        </w:tc>
-        <w:tc>
-          <w:tcPr>
-            <w:tcW w:type="dxa" w:w="960"/>
-          </w:tcPr>
-          <w:p>
-            <w:r>
-              <w:t>0.1345</w:t>
-            </w:r>
-          </w:p>
-        </w:tc>
-        <w:tc>
-          <w:tcPr>
-            <w:tcW w:type="dxa" w:w="960"/>
-          </w:tcPr>
-          <w:p>
-            <w:r>
-              <w:t>299.8226</w:t>
-            </w:r>
-          </w:p>
-        </w:tc>
-        <w:tc>
-          <w:tcPr>
-            <w:tcW w:type="dxa" w:w="960"/>
-          </w:tcPr>
-          <w:p>
-            <w:r>
-              <w:t>1.0000</w:t>
-            </w:r>
-          </w:p>
-        </w:tc>
-      </w:tr>
-      <w:tr>
-        <w:tc>
-          <w:tcPr>
-            <w:tcW w:type="dxa" w:w="960"/>
-          </w:tcPr>
-          <w:p>
-            <w:r>
               <w:t>S10</w:t>
-            </w:r>
-          </w:p>
-        </w:tc>
-        <w:tc>
-          <w:tcPr>
-            <w:tcW w:type="dxa" w:w="960"/>
-          </w:tcPr>
-          <w:p>
-            <w:r>
-              <w:t>模拟射击</w:t>
-            </w:r>
-          </w:p>
-        </w:tc>
-        <w:tc>
-          <w:tcPr>
-            <w:tcW w:type="dxa" w:w="960"/>
-          </w:tcPr>
-          <w:p>
-            <w:r>
-              <w:t>510.6000</w:t>
-            </w:r>
-          </w:p>
-        </w:tc>
-        <w:tc>
-          <w:tcPr>
-            <w:tcW w:type="dxa" w:w="960"/>
-          </w:tcPr>
-          <w:p>
-            <w:r>
-              <w:t>512.1000</w:t>
-            </w:r>
-          </w:p>
-        </w:tc>
-        <w:tc>
-          <w:tcPr>
-            <w:tcW w:type="dxa" w:w="960"/>
-          </w:tcPr>
-          <w:p>
-            <w:r>
-              <w:t>10.1993</w:t>
-            </w:r>
-          </w:p>
-        </w:tc>
-        <w:tc>
-          <w:tcPr>
-            <w:tcW w:type="dxa" w:w="960"/>
-          </w:tcPr>
-          <w:p>
-            <w:r>
-              <w:t>1.9175</w:t>
-            </w:r>
-          </w:p>
-        </w:tc>
-        <w:tc>
-          <w:tcPr>
-            <w:tcW w:type="dxa" w:w="960"/>
-          </w:tcPr>
-          <w:p>
-            <w:r>
-              <w:t>0.4766</w:t>
-            </w:r>
-          </w:p>
-        </w:tc>
-        <w:tc>
-          <w:tcPr>
-            <w:tcW w:type="dxa" w:w="960"/>
-          </w:tcPr>
-          <w:p>
-            <w:r/>
-          </w:p>
-        </w:tc>
-        <w:tc>
-          <w:tcPr>
-            <w:tcW w:type="dxa" w:w="960"/>
-          </w:tcPr>
-          <w:p>
-            <w:r>
-              <w:t>0.8500</w:t>
-            </w:r>
-          </w:p>
-        </w:tc>
-      </w:tr>
-      <w:tr>
-        <w:tc>
-          <w:tcPr>
-            <w:tcW w:type="dxa" w:w="960"/>
-          </w:tcPr>
-          <w:p>
-            <w:r>
-              <w:t>S12</w:t>
             </w:r>
           </w:p>
         </w:tc>
@@ -2418,7 +2418,7 @@
           </w:tcPr>
           <w:p>
             <w:r>
-              <w:t>25.6918</w:t>
+              <w:t>10.0034</w:t>
             </w:r>
           </w:p>
         </w:tc>
@@ -2428,7 +2428,7 @@
           </w:tcPr>
           <w:p>
             <w:r>
-              <w:t>1.6060</w:t>
+              <w:t>1.6044</w:t>
             </w:r>
           </w:p>
         </w:tc>
@@ -2438,7 +2438,7 @@
           </w:tcPr>
           <w:p>
             <w:r>
-              <w:t>0.2682</w:t>
+              <w:t>0.2684</w:t>
             </w:r>
           </w:p>
         </w:tc>
@@ -2508,7 +2508,7 @@
           </w:tcPr>
           <w:p>
             <w:r>
-              <w:t>22.3780</w:t>
+              <w:t>22.4832</w:t>
             </w:r>
           </w:p>
         </w:tc>
@@ -2518,7 +2518,7 @@
           </w:tcPr>
           <w:p>
             <w:r>
-              <w:t>1.3748</w:t>
+              <w:t>1.3729</w:t>
             </w:r>
           </w:p>
         </w:tc>
@@ -2528,7 +2528,7 @@
           </w:tcPr>
           <w:p>
             <w:r>
-              <w:t>0.1478</w:t>
+              <w:t>0.1506</w:t>
             </w:r>
           </w:p>
         </w:tc>
@@ -2538,7 +2538,7 @@
           </w:tcPr>
           <w:p>
             <w:r>
-              <w:t>269.2684</w:t>
+              <w:t>269.0805</w:t>
             </w:r>
           </w:p>
         </w:tc>
@@ -2560,7 +2560,7 @@
           </w:tcPr>
           <w:p>
             <w:r>
-              <w:t>S15</w:t>
+              <w:t>S14</w:t>
             </w:r>
           </w:p>
         </w:tc>
@@ -2600,7 +2600,7 @@
           </w:tcPr>
           <w:p>
             <w:r>
-              <w:t>16.6584</w:t>
+              <w:t>10.9431</w:t>
             </w:r>
           </w:p>
         </w:tc>
@@ -2610,7 +2610,7 @@
           </w:tcPr>
           <w:p>
             <w:r>
-              <w:t>1.9060</w:t>
+              <w:t>1.9053</w:t>
             </w:r>
           </w:p>
         </w:tc>
@@ -2620,7 +2620,7 @@
           </w:tcPr>
           <w:p>
             <w:r>
-              <w:t>0.1945</w:t>
+              <w:t>0.1917</w:t>
             </w:r>
           </w:p>
         </w:tc>
@@ -2690,7 +2690,7 @@
           </w:tcPr>
           <w:p>
             <w:r>
-              <w:t>29.7510</w:t>
+              <w:t>29.7331</w:t>
             </w:r>
           </w:p>
         </w:tc>
@@ -2700,7 +2700,7 @@
           </w:tcPr>
           <w:p>
             <w:r>
-              <w:t>0.9937</w:t>
+              <w:t>0.9917</w:t>
             </w:r>
           </w:p>
         </w:tc>
@@ -2710,7 +2710,7 @@
           </w:tcPr>
           <w:p>
             <w:r>
-              <w:t>0.2744</w:t>
+              <w:t>0.2767</w:t>
             </w:r>
           </w:p>
         </w:tc>
@@ -2869,7 +2869,7 @@
           </w:tcPr>
           <w:p>
             <w:r>
-              <w:t>214</w:t>
+              <w:t>210</w:t>
             </w:r>
           </w:p>
         </w:tc>
@@ -2931,7 +2931,7 @@
           </w:tcPr>
           <w:p>
             <w:r>
-              <w:t>327</w:t>
+              <w:t>326</w:t>
             </w:r>
           </w:p>
         </w:tc>
@@ -2993,7 +2993,7 @@
           </w:tcPr>
           <w:p>
             <w:r>
-              <w:t>341</w:t>
+              <w:t>337</w:t>
             </w:r>
           </w:p>
         </w:tc>
@@ -3194,7 +3194,7 @@
           <w:rFonts w:ascii="宋体" w:hAnsi="宋体"/>
           <w:sz w:val="24"/>
         </w:rPr>
-        <w:t>模型优点是参数含义清晰、数据驱动且可复现；时间对齐采用重叠时长约束和截尾误差，能降低噪声与局部异常点影响；系统偏差判定同时考虑统计显著性和工程效应量，避免过度修正；问题4用0-1整数规划统一处理时间互斥、射击唯一性和拍照角度冲突，比简单贪心更稳健。局限在于速度和加速度由定位轨迹差分得到，受平滑窗口影响；任务优化是在10Hz离散轨迹上的最优解，若需要连续时间全局最优，可进一步建立更细粒度的混合整数规划。</w:t>
+        <w:t>模型优点是参数含义清晰、数据驱动且可复现；时间对齐采用重叠时长约束和截尾误差，能降低噪声与局部异常点影响；系统偏差判定以F检验为统计依据，并附加工程效应量作为量级参考；问题4用0-1整数规划统一处理时间互斥、射击唯一性和拍照角度冲突，比简单贪心更稳健。局限在于速度和加速度由定位轨迹差分得到，受平滑窗口影响；任务优化是在10Hz离散轨迹上的最优解，若需要连续时间全局最优，可进一步建立更细粒度的混合整数规划。</w:t>
       </w:r>
     </w:p>
     <w:p>

</xml_diff>